<commit_message>
Day 1 completed: Modular structure, parsing, weighted scoring, JSON skill system
</commit_message>
<xml_diff>
--- a/uploads/R_3.docx
+++ b/uploads/R_3.docx
@@ -37,6 +37,19 @@
         <w:t>Machine Learning</w:t>
       </w:r>
     </w:p>
+    <w:p>
+      <w:proofErr w:type="spellStart"/>
+      <w:r>
+        <w:t>Sql</w:t>
+      </w:r>
+      <w:proofErr w:type="spellEnd"/>
+    </w:p>
+    <w:p>
+      <w:r>
+        <w:t>Adobe XD</w:t>
+      </w:r>
+    </w:p>
+    <w:p/>
     <w:sectPr>
       <w:pgSz w:w="11906" w:h="16838"/>
       <w:pgMar w:top="1440" w:right="1440" w:bottom="1440" w:left="1440" w:header="708" w:footer="708" w:gutter="0"/>

</xml_diff>

<commit_message>
Phase 1 Complete: SmartATS Resume Analyzer
</commit_message>
<xml_diff>
--- a/uploads/R_3.docx
+++ b/uploads/R_3.docx
@@ -8,18 +8,13 @@
       </w:r>
     </w:p>
     <w:p>
-      <w:proofErr w:type="spellStart"/>
       <w:r>
-        <w:t>Altrin</w:t>
-      </w:r>
-      <w:proofErr w:type="spellEnd"/>
-      <w:r>
-        <w:t xml:space="preserve"> Joshua </w:t>
+        <w:t xml:space="preserve">Altrin Joshua </w:t>
       </w:r>
     </w:p>
     <w:p>
       <w:r>
-        <w:t xml:space="preserve">Python </w:t>
+        <w:t xml:space="preserve">Pyton </w:t>
       </w:r>
     </w:p>
     <w:p>
@@ -34,19 +29,22 @@
     </w:p>
     <w:p>
       <w:r>
-        <w:t>Machine Learning</w:t>
+        <w:t>ML</w:t>
       </w:r>
     </w:p>
     <w:p>
-      <w:proofErr w:type="spellStart"/>
       <w:r>
         <w:t>Sql</w:t>
       </w:r>
-      <w:proofErr w:type="spellEnd"/>
     </w:p>
     <w:p>
       <w:r>
         <w:t>Adobe XD</w:t>
+      </w:r>
+    </w:p>
+    <w:p>
+      <w:r>
+        <w:t>pandas</w:t>
       </w:r>
     </w:p>
     <w:p/>
@@ -663,6 +661,7 @@
   <w:style w:type="character" w:default="1" w:styleId="DefaultParagraphFont">
     <w:name w:val="Default Paragraph Font"/>
     <w:uiPriority w:val="1"/>
+    <w:semiHidden/>
     <w:unhideWhenUsed/>
   </w:style>
   <w:style w:type="table" w:default="1" w:styleId="TableNormal">

</xml_diff>